<commit_message>
Refresh Phase 6 demonstration evidence
</commit_message>
<xml_diff>
--- a/docs/Mukota_Prototype_Demonstration_Guide.docx
+++ b/docs/Mukota_Prototype_Demonstration_Guide.docx
@@ -178,7 +178,7 @@
           <w:color w:val="000000"/>
           <w:sz w:val="24"/>
         </w:rPr>
-        <w:t>4 September 2026</w:t>
+        <w:t>5 September 2026</w:t>
       </w:r>
     </w:p>
     <w:p>
@@ -3845,7 +3845,7 @@
                 <w:color w:val="000000"/>
                 <w:sz w:val="18"/>
               </w:rPr>
-              <w:t>9 milliseconds</w:t>
+              <w:t>10 milliseconds</w:t>
             </w:r>
           </w:p>
         </w:tc>
@@ -4080,7 +4080,7 @@
                 <w:color w:val="000000"/>
                 <w:sz w:val="18"/>
               </w:rPr>
-              <w:t>83.36 CPU percentage points; 2.58 MiB memory change</w:t>
+              <w:t>-68.85 CPU percentage points; 6.84 MiB memory change</w:t>
             </w:r>
           </w:p>
         </w:tc>

</xml_diff>